<commit_message>
Varianta finala: Adaugare in readme executie
</commit_message>
<xml_diff>
--- a/README.docx
+++ b/README.docx
@@ -1675,50 +1675,53 @@
       </w:r>
       <w:proofErr w:type="spellEnd"/>
       <w:r>
-        <w:t xml:space="preserve"> care merge </w:t>
-      </w:r>
-      <w:proofErr w:type="spellStart"/>
-      <w:r>
-        <w:t>spre</w:t>
-      </w:r>
-      <w:proofErr w:type="spellEnd"/>
-      <w:r>
-        <w:t xml:space="preserve"> </w:t>
-      </w:r>
-      <w:proofErr w:type="spellStart"/>
-      <w:r>
-        <w:t>stânga</w:t>
-      </w:r>
-      <w:proofErr w:type="spellEnd"/>
-      <w:r>
-        <w:t xml:space="preserve"> </w:t>
-      </w:r>
-      <w:proofErr w:type="spellStart"/>
-      <w:r>
-        <w:t>și</w:t>
-      </w:r>
-      <w:proofErr w:type="spellEnd"/>
-      <w:r>
-        <w:t xml:space="preserve"> </w:t>
-      </w:r>
-      <w:proofErr w:type="spellStart"/>
-      <w:r>
-        <w:t>celălalt</w:t>
-      </w:r>
-      <w:proofErr w:type="spellEnd"/>
-      <w:r>
-        <w:t xml:space="preserve"> </w:t>
-      </w:r>
-      <w:proofErr w:type="spellStart"/>
-      <w:r>
-        <w:t>spre</w:t>
-      </w:r>
-      <w:proofErr w:type="spellEnd"/>
-      <w:r>
-        <w:t xml:space="preserve"> </w:t>
+        <w:t xml:space="preserve"> care m</w:t>
       </w:r>
       <w:bookmarkStart w:id="0" w:name="_GoBack"/>
       <w:bookmarkEnd w:id="0"/>
+      <w:r>
+        <w:t xml:space="preserve">erge </w:t>
+      </w:r>
+      <w:proofErr w:type="spellStart"/>
+      <w:r>
+        <w:t>spre</w:t>
+      </w:r>
+      <w:proofErr w:type="spellEnd"/>
+      <w:r>
+        <w:t xml:space="preserve"> </w:t>
+      </w:r>
+      <w:proofErr w:type="spellStart"/>
+      <w:r>
+        <w:t>stânga</w:t>
+      </w:r>
+      <w:proofErr w:type="spellEnd"/>
+      <w:r>
+        <w:t xml:space="preserve"> </w:t>
+      </w:r>
+      <w:proofErr w:type="spellStart"/>
+      <w:r>
+        <w:t>și</w:t>
+      </w:r>
+      <w:proofErr w:type="spellEnd"/>
+      <w:r>
+        <w:t xml:space="preserve"> </w:t>
+      </w:r>
+      <w:proofErr w:type="spellStart"/>
+      <w:r>
+        <w:t>celălalt</w:t>
+      </w:r>
+      <w:proofErr w:type="spellEnd"/>
+      <w:r>
+        <w:t xml:space="preserve"> </w:t>
+      </w:r>
+      <w:proofErr w:type="spellStart"/>
+      <w:r>
+        <w:t>spre</w:t>
+      </w:r>
+      <w:proofErr w:type="spellEnd"/>
+      <w:r>
+        <w:t xml:space="preserve"> </w:t>
+      </w:r>
       <w:proofErr w:type="spellStart"/>
       <w:r>
         <w:t>dreapta</w:t>
@@ -2596,7 +2599,167 @@
         <w:t>.</w:t>
       </w:r>
     </w:p>
-    <w:p/>
+    <w:p>
+      <w:pPr>
+        <w:pStyle w:val="NormalWeb"/>
+        <w:ind w:firstLine="720"/>
+        <w:jc w:val="both"/>
+      </w:pPr>
+      <w:proofErr w:type="spellStart"/>
+      <w:r>
+        <w:t>Executie</w:t>
+      </w:r>
+      <w:proofErr w:type="spellEnd"/>
+      <w:r>
+        <w:t xml:space="preserve">: In </w:t>
+      </w:r>
+      <w:proofErr w:type="spellStart"/>
+      <w:r>
+        <w:t>directorul</w:t>
+      </w:r>
+      <w:proofErr w:type="spellEnd"/>
+      <w:r>
+        <w:t xml:space="preserve"> </w:t>
+      </w:r>
+      <w:proofErr w:type="spellStart"/>
+      <w:r>
+        <w:t>gigiquant</w:t>
+      </w:r>
+      <w:proofErr w:type="spellEnd"/>
+      <w:r>
+        <w:t xml:space="preserve"> se </w:t>
+      </w:r>
+      <w:proofErr w:type="spellStart"/>
+      <w:r>
+        <w:t>tasteaza</w:t>
+      </w:r>
+      <w:proofErr w:type="spellEnd"/>
+      <w:r>
+        <w:t xml:space="preserve"> in </w:t>
+      </w:r>
+      <w:proofErr w:type="gramStart"/>
+      <w:r>
+        <w:t xml:space="preserve">terminal </w:t>
+      </w:r>
+      <w:r>
+        <w:rPr>
+          <w:b/>
+          <w:i/>
+        </w:rPr>
+        <w:t>./</w:t>
+      </w:r>
+      <w:proofErr w:type="gramEnd"/>
+      <w:r>
+        <w:rPr>
+          <w:b/>
+          <w:i/>
+        </w:rPr>
+        <w:t>checker –</w:t>
+      </w:r>
+      <w:proofErr w:type="spellStart"/>
+      <w:r>
+        <w:rPr>
+          <w:b/>
+          <w:i/>
+        </w:rPr>
+        <w:t>i</w:t>
+      </w:r>
+      <w:proofErr w:type="spellEnd"/>
+      <w:r>
+        <w:t xml:space="preserve">, </w:t>
+      </w:r>
+      <w:proofErr w:type="spellStart"/>
+      <w:r>
+        <w:t>iar</w:t>
+      </w:r>
+      <w:proofErr w:type="spellEnd"/>
+      <w:r>
+        <w:t xml:space="preserve"> </w:t>
+      </w:r>
+      <w:proofErr w:type="spellStart"/>
+      <w:r>
+        <w:t>executabilul</w:t>
+      </w:r>
+      <w:proofErr w:type="spellEnd"/>
+      <w:r>
+        <w:t xml:space="preserve"> se face in </w:t>
+      </w:r>
+      <w:proofErr w:type="spellStart"/>
+      <w:r>
+        <w:t>fisierul</w:t>
+      </w:r>
+      <w:proofErr w:type="spellEnd"/>
+      <w:r>
+        <w:t xml:space="preserve"> </w:t>
+      </w:r>
+      <w:proofErr w:type="spellStart"/>
+      <w:r>
+        <w:t>src</w:t>
+      </w:r>
+      <w:proofErr w:type="spellEnd"/>
+      <w:r>
+        <w:t xml:space="preserve"> din </w:t>
+      </w:r>
+      <w:proofErr w:type="spellStart"/>
+      <w:r>
+        <w:t>gigiquant</w:t>
+      </w:r>
+      <w:proofErr w:type="spellEnd"/>
+      <w:r>
+        <w:t xml:space="preserve"> </w:t>
+      </w:r>
+      <w:proofErr w:type="spellStart"/>
+      <w:r>
+        <w:t>si</w:t>
+      </w:r>
+      <w:proofErr w:type="spellEnd"/>
+      <w:r>
+        <w:t xml:space="preserve"> </w:t>
+      </w:r>
+      <w:proofErr w:type="spellStart"/>
+      <w:r>
+        <w:t>este</w:t>
+      </w:r>
+      <w:proofErr w:type="spellEnd"/>
+      <w:r>
+        <w:t xml:space="preserve">: </w:t>
+      </w:r>
+      <w:proofErr w:type="spellStart"/>
+      <w:r>
+        <w:rPr>
+          <w:b/>
+          <w:i/>
+        </w:rPr>
+        <w:t>gcc</w:t>
+      </w:r>
+      <w:proofErr w:type="spellEnd"/>
+      <w:r>
+        <w:rPr>
+          <w:b/>
+          <w:i/>
+        </w:rPr>
+        <w:t xml:space="preserve"> </w:t>
+      </w:r>
+      <w:proofErr w:type="spellStart"/>
+      <w:r>
+        <w:rPr>
+          <w:b/>
+          <w:i/>
+        </w:rPr>
+        <w:t>mainPA.c</w:t>
+      </w:r>
+      <w:proofErr w:type="spellEnd"/>
+      <w:r>
+        <w:rPr>
+          <w:b/>
+          <w:i/>
+        </w:rPr>
+        <w:t xml:space="preserve"> task1.c task2.c task3.c task4.c –o test –lm</w:t>
+      </w:r>
+      <w:r>
+        <w:t>.</w:t>
+      </w:r>
+    </w:p>
     <w:sectPr>
       <w:pgSz w:w="12240" w:h="15840"/>
       <w:pgMar w:top="1440" w:right="1440" w:bottom="1440" w:left="1440" w:header="720" w:footer="720" w:gutter="0"/>
@@ -3032,7 +3195,6 @@
     <w:name w:val="Normal (Web)"/>
     <w:basedOn w:val="Normal"/>
     <w:uiPriority w:val="99"/>
-    <w:semiHidden/>
     <w:unhideWhenUsed/>
     <w:rsid w:val="00165235"/>
     <w:pPr>

</xml_diff>